<commit_message>
Se agrega a las plantillas pie de pagina con el plazo de vigencia
</commit_message>
<xml_diff>
--- a/plantillas/CERTIFICADO IGNORADO DOMICILIO.docx
+++ b/plantillas/CERTIFICADO IGNORADO DOMICILIO.docx
@@ -62,7 +62,56 @@
           <w:szCs w:val="28"/>
           <w:lang w:val="es-AR" w:eastAsia="es-AR"/>
         </w:rPr>
-        <w:t xml:space="preserve">Actuación TICKET Nº </w:t>
+        <w:t xml:space="preserve">Actuación </w:t>
+      </w:r>
+      <w:proofErr w:type="gramStart"/>
+      <w:r>
+        <w:rPr>
+          <w:rFonts w:ascii="Caladea" w:hAnsi="Caladea" w:cs="Courier New"/>
+          <w:b/>
+          <w:color w:val="000000"/>
+          <w:sz w:val="28"/>
+          <w:szCs w:val="28"/>
+          <w:lang w:val="es-AR" w:eastAsia="es-AR"/>
+        </w:rPr>
+        <w:t>TICKET</w:t>
+      </w:r>
+      <w:proofErr w:type="gramEnd"/>
+      <w:r>
+        <w:rPr>
+          <w:rFonts w:ascii="Caladea" w:hAnsi="Caladea" w:cs="Courier New"/>
+          <w:b/>
+          <w:color w:val="000000"/>
+          <w:sz w:val="28"/>
+          <w:szCs w:val="28"/>
+          <w:lang w:val="es-AR" w:eastAsia="es-AR"/>
+        </w:rPr>
+        <w:t xml:space="preserve"> </w:t>
+      </w:r>
+      <w:proofErr w:type="spellStart"/>
+      <w:proofErr w:type="gramStart"/>
+      <w:r>
+        <w:rPr>
+          <w:rFonts w:ascii="Caladea" w:hAnsi="Caladea" w:cs="Courier New"/>
+          <w:b/>
+          <w:color w:val="000000"/>
+          <w:sz w:val="28"/>
+          <w:szCs w:val="28"/>
+          <w:lang w:val="es-AR" w:eastAsia="es-AR"/>
+        </w:rPr>
+        <w:t>Nº</w:t>
+      </w:r>
+      <w:proofErr w:type="spellEnd"/>
+      <w:r>
+        <w:rPr>
+          <w:rFonts w:ascii="Caladea" w:hAnsi="Caladea" w:cs="Courier New"/>
+          <w:b/>
+          <w:color w:val="000000"/>
+          <w:sz w:val="28"/>
+          <w:szCs w:val="28"/>
+          <w:lang w:val="es-AR" w:eastAsia="es-AR"/>
+        </w:rPr>
+        <w:t xml:space="preserve"> </w:t>
       </w:r>
       <w:r>
         <w:rPr>
@@ -85,7 +134,46 @@
           <w:szCs w:val="28"/>
           <w:lang w:val="es-AR" w:eastAsia="es-AR"/>
         </w:rPr>
-        <w:t>{{TICKET}}</w:t>
+        <w:t>{</w:t>
+      </w:r>
+      <w:proofErr w:type="gramEnd"/>
+      <w:r>
+        <w:rPr>
+          <w:rStyle w:val="readonlyattribute"/>
+          <w:rFonts w:ascii="Caladea" w:hAnsi="Caladea" w:cs="Courier New" w:hint="eastAsia"/>
+          <w:b/>
+          <w:color w:val="000000"/>
+          <w:sz w:val="28"/>
+          <w:szCs w:val="28"/>
+          <w:lang w:val="es-AR" w:eastAsia="es-AR"/>
+        </w:rPr>
+        <w:t>{</w:t>
+      </w:r>
+      <w:proofErr w:type="gramStart"/>
+      <w:r>
+        <w:rPr>
+          <w:rStyle w:val="readonlyattribute"/>
+          <w:rFonts w:ascii="Caladea" w:hAnsi="Caladea" w:cs="Courier New" w:hint="eastAsia"/>
+          <w:b/>
+          <w:color w:val="000000"/>
+          <w:sz w:val="28"/>
+          <w:szCs w:val="28"/>
+          <w:lang w:val="es-AR" w:eastAsia="es-AR"/>
+        </w:rPr>
+        <w:t>TICKET</w:t>
+      </w:r>
+      <w:proofErr w:type="gramEnd"/>
+      <w:r>
+        <w:rPr>
+          <w:rStyle w:val="readonlyattribute"/>
+          <w:rFonts w:ascii="Caladea" w:hAnsi="Caladea" w:cs="Courier New" w:hint="eastAsia"/>
+          <w:b/>
+          <w:color w:val="000000"/>
+          <w:sz w:val="28"/>
+          <w:szCs w:val="28"/>
+          <w:lang w:val="es-AR" w:eastAsia="es-AR"/>
+        </w:rPr>
+        <w:t>}}</w:t>
       </w:r>
     </w:p>
     <w:p>
@@ -132,7 +220,95 @@
           <w:szCs w:val="28"/>
           <w:lang w:val="es-AR" w:eastAsia="es-AR"/>
         </w:rPr>
-        <w:t>En Mendoza, a los {{FECHA_CERTIFICADO}}, en Ticket iniciado por {{NOMBRE_SOLICITANTE}},  D.N.I. {{DNI_SOLICITANTE}}, quien solicita la intervención del Cuerpo de Mediadores mediante el ticket indicado, y declara desconocer el domicilio y teléfono de  {{NOMBRE_PERSONA}}, DNI {{DNI_PERSONA}}. Conforme lo expuesto, y resultando imposible la notificación necesaria para realizar un proceso de mediación, se da por cumplida la etapa previa de la Ley Provincial 9120 (art. 25 inc. e). Se labra el presente como documento habilitante para el inicio de la instancia judicial.</w:t>
+        <w:t xml:space="preserve">En Mendoza, a los {{FECHA_CERTIFICADO}}, en </w:t>
+      </w:r>
+      <w:proofErr w:type="gramStart"/>
+      <w:r>
+        <w:rPr>
+          <w:rFonts w:ascii="Caladea" w:hAnsi="Caladea" w:cs="Courier New" w:hint="eastAsia"/>
+          <w:color w:val="000000"/>
+          <w:sz w:val="28"/>
+          <w:szCs w:val="28"/>
+          <w:lang w:val="es-AR" w:eastAsia="es-AR"/>
+        </w:rPr>
+        <w:t>Ticket</w:t>
+      </w:r>
+      <w:proofErr w:type="gramEnd"/>
+      <w:r>
+        <w:rPr>
+          <w:rFonts w:ascii="Caladea" w:hAnsi="Caladea" w:cs="Courier New" w:hint="eastAsia"/>
+          <w:color w:val="000000"/>
+          <w:sz w:val="28"/>
+          <w:szCs w:val="28"/>
+          <w:lang w:val="es-AR" w:eastAsia="es-AR"/>
+        </w:rPr>
+        <w:t xml:space="preserve"> iniciado por {{NOMBRE_SOLICITANTE}</w:t>
+      </w:r>
+      <w:proofErr w:type="gramStart"/>
+      <w:r>
+        <w:rPr>
+          <w:rFonts w:ascii="Caladea" w:hAnsi="Caladea" w:cs="Courier New" w:hint="eastAsia"/>
+          <w:color w:val="000000"/>
+          <w:sz w:val="28"/>
+          <w:szCs w:val="28"/>
+          <w:lang w:val="es-AR" w:eastAsia="es-AR"/>
+        </w:rPr>
+        <w:t>},  D.N.I.</w:t>
+      </w:r>
+      <w:proofErr w:type="gramEnd"/>
+      <w:r>
+        <w:rPr>
+          <w:rFonts w:ascii="Caladea" w:hAnsi="Caladea" w:cs="Courier New" w:hint="eastAsia"/>
+          <w:color w:val="000000"/>
+          <w:sz w:val="28"/>
+          <w:szCs w:val="28"/>
+          <w:lang w:val="es-AR" w:eastAsia="es-AR"/>
+        </w:rPr>
+        <w:t xml:space="preserve"> {{DNI_SOLICITANTE}}, quien solicita la intervención del Cuerpo de Mediadores mediante el </w:t>
+      </w:r>
+      <w:proofErr w:type="gramStart"/>
+      <w:r>
+        <w:rPr>
+          <w:rFonts w:ascii="Caladea" w:hAnsi="Caladea" w:cs="Courier New" w:hint="eastAsia"/>
+          <w:color w:val="000000"/>
+          <w:sz w:val="28"/>
+          <w:szCs w:val="28"/>
+          <w:lang w:val="es-AR" w:eastAsia="es-AR"/>
+        </w:rPr>
+        <w:t>ticket</w:t>
+      </w:r>
+      <w:proofErr w:type="gramEnd"/>
+      <w:r>
+        <w:rPr>
+          <w:rFonts w:ascii="Caladea" w:hAnsi="Caladea" w:cs="Courier New" w:hint="eastAsia"/>
+          <w:color w:val="000000"/>
+          <w:sz w:val="28"/>
+          <w:szCs w:val="28"/>
+          <w:lang w:val="es-AR" w:eastAsia="es-AR"/>
+        </w:rPr>
+        <w:t xml:space="preserve"> indicado, y declara desconocer el domicilio y teléfono </w:t>
+      </w:r>
+      <w:proofErr w:type="gramStart"/>
+      <w:r>
+        <w:rPr>
+          <w:rFonts w:ascii="Caladea" w:hAnsi="Caladea" w:cs="Courier New" w:hint="eastAsia"/>
+          <w:color w:val="000000"/>
+          <w:sz w:val="28"/>
+          <w:szCs w:val="28"/>
+          <w:lang w:val="es-AR" w:eastAsia="es-AR"/>
+        </w:rPr>
+        <w:t>de  {</w:t>
+      </w:r>
+      <w:proofErr w:type="gramEnd"/>
+      <w:r>
+        <w:rPr>
+          <w:rFonts w:ascii="Caladea" w:hAnsi="Caladea" w:cs="Courier New" w:hint="eastAsia"/>
+          <w:color w:val="000000"/>
+          <w:sz w:val="28"/>
+          <w:szCs w:val="28"/>
+          <w:lang w:val="es-AR" w:eastAsia="es-AR"/>
+        </w:rPr>
+        <w:t>{NOMBRE_PERSONA}}, DNI {{DNI_PERSONA}}. Conforme lo expuesto, y resultando imposible la notificación necesaria para realizar un proceso de mediación, se da por cumplida la etapa previa de la Ley Provincial 9120 (art. 25 inc. e). Se labra el presente como documento habilitante para el inicio de la instancia judicial.</w:t>
       </w:r>
     </w:p>
     <w:p>
@@ -214,6 +390,168 @@
           <w:sz w:val="28"/>
           <w:szCs w:val="28"/>
           <w:lang w:val="es-AR" w:eastAsia="es-AR"/>
+        </w:rPr>
+      </w:pPr>
+    </w:p>
+    <w:p>
+      <w:pPr>
+        <w:pStyle w:val="Sinespaciado"/>
+        <w:spacing w:line="360" w:lineRule="auto"/>
+        <w:jc w:val="both"/>
+        <w:rPr>
+          <w:rFonts w:ascii="Caladea" w:hAnsi="Caladea" w:cs="Courier New"/>
+          <w:color w:val="000000"/>
+          <w:sz w:val="28"/>
+          <w:szCs w:val="28"/>
+          <w:lang w:val="es-AR" w:eastAsia="es-AR"/>
+        </w:rPr>
+      </w:pPr>
+    </w:p>
+    <w:p>
+      <w:pPr>
+        <w:pStyle w:val="Sinespaciado"/>
+        <w:spacing w:line="360" w:lineRule="auto"/>
+        <w:jc w:val="both"/>
+        <w:rPr>
+          <w:rFonts w:ascii="Caladea" w:hAnsi="Caladea" w:cs="Courier New"/>
+          <w:color w:val="000000"/>
+          <w:sz w:val="28"/>
+          <w:szCs w:val="28"/>
+          <w:lang w:val="es-AR" w:eastAsia="es-AR"/>
+        </w:rPr>
+      </w:pPr>
+    </w:p>
+    <w:p>
+      <w:pPr>
+        <w:pStyle w:val="Sinespaciado"/>
+        <w:spacing w:line="360" w:lineRule="auto"/>
+        <w:jc w:val="both"/>
+        <w:rPr>
+          <w:rFonts w:ascii="Caladea" w:hAnsi="Caladea" w:cs="Courier New"/>
+          <w:color w:val="000000"/>
+          <w:sz w:val="28"/>
+          <w:szCs w:val="28"/>
+          <w:lang w:val="es-AR" w:eastAsia="es-AR"/>
+        </w:rPr>
+      </w:pPr>
+    </w:p>
+    <w:p>
+      <w:pPr>
+        <w:pStyle w:val="Sinespaciado"/>
+        <w:spacing w:line="360" w:lineRule="auto"/>
+        <w:jc w:val="both"/>
+        <w:rPr>
+          <w:rFonts w:ascii="Caladea" w:hAnsi="Caladea" w:cs="Courier New"/>
+          <w:b/>
+          <w:color w:val="000000"/>
+          <w:sz w:val="22"/>
+          <w:szCs w:val="22"/>
+          <w:lang w:eastAsia="es-AR"/>
+        </w:rPr>
+      </w:pPr>
+    </w:p>
+    <w:p>
+      <w:pPr>
+        <w:pStyle w:val="Sinespaciado"/>
+        <w:spacing w:line="360" w:lineRule="auto"/>
+        <w:jc w:val="both"/>
+        <w:rPr>
+          <w:rFonts w:ascii="Caladea" w:hAnsi="Caladea" w:cs="Courier New"/>
+          <w:b/>
+          <w:color w:val="000000"/>
+          <w:sz w:val="22"/>
+          <w:szCs w:val="22"/>
+          <w:lang w:eastAsia="es-AR"/>
+        </w:rPr>
+      </w:pPr>
+    </w:p>
+    <w:p>
+      <w:pPr>
+        <w:pStyle w:val="Sinespaciado"/>
+        <w:spacing w:line="360" w:lineRule="auto"/>
+        <w:jc w:val="both"/>
+        <w:rPr>
+          <w:rFonts w:ascii="Caladea" w:hAnsi="Caladea" w:cs="Courier New"/>
+          <w:b/>
+          <w:color w:val="000000"/>
+          <w:sz w:val="22"/>
+          <w:szCs w:val="22"/>
+          <w:lang w:eastAsia="es-AR"/>
+        </w:rPr>
+      </w:pPr>
+    </w:p>
+    <w:p>
+      <w:pPr>
+        <w:pStyle w:val="Sinespaciado"/>
+        <w:spacing w:line="360" w:lineRule="auto"/>
+        <w:jc w:val="both"/>
+        <w:rPr>
+          <w:rFonts w:ascii="Caladea" w:hAnsi="Caladea" w:cs="Courier New"/>
+          <w:b/>
+          <w:color w:val="000000"/>
+          <w:sz w:val="22"/>
+          <w:szCs w:val="22"/>
+          <w:lang w:eastAsia="es-AR"/>
+        </w:rPr>
+      </w:pPr>
+    </w:p>
+    <w:p>
+      <w:pPr>
+        <w:pStyle w:val="Sinespaciado"/>
+        <w:spacing w:line="360" w:lineRule="auto"/>
+        <w:jc w:val="both"/>
+        <w:rPr>
+          <w:rFonts w:ascii="Caladea" w:hAnsi="Caladea" w:cs="Courier New"/>
+          <w:b/>
+          <w:color w:val="000000"/>
+          <w:sz w:val="22"/>
+          <w:szCs w:val="22"/>
+          <w:lang w:eastAsia="es-AR"/>
+        </w:rPr>
+      </w:pPr>
+    </w:p>
+    <w:p>
+      <w:pPr>
+        <w:pStyle w:val="Sinespaciado"/>
+        <w:spacing w:line="360" w:lineRule="auto"/>
+        <w:jc w:val="both"/>
+        <w:rPr>
+          <w:rFonts w:ascii="Caladea" w:hAnsi="Caladea" w:cs="Courier New"/>
+          <w:b/>
+          <w:color w:val="000000"/>
+          <w:sz w:val="22"/>
+          <w:szCs w:val="22"/>
+          <w:lang w:eastAsia="es-AR"/>
+        </w:rPr>
+      </w:pPr>
+    </w:p>
+    <w:p>
+      <w:pPr>
+        <w:pStyle w:val="Sinespaciado"/>
+        <w:spacing w:line="360" w:lineRule="auto"/>
+        <w:jc w:val="both"/>
+        <w:rPr>
+          <w:rFonts w:ascii="Caladea" w:hAnsi="Caladea" w:cs="Courier New"/>
+          <w:b/>
+          <w:color w:val="000000"/>
+          <w:sz w:val="22"/>
+          <w:szCs w:val="22"/>
+          <w:lang w:eastAsia="es-AR"/>
+        </w:rPr>
+      </w:pPr>
+    </w:p>
+    <w:p>
+      <w:pPr>
+        <w:pStyle w:val="Sinespaciado"/>
+        <w:spacing w:line="360" w:lineRule="auto"/>
+        <w:jc w:val="both"/>
+        <w:rPr>
+          <w:rFonts w:ascii="Caladea" w:hAnsi="Caladea" w:cs="Courier New"/>
+          <w:b/>
+          <w:color w:val="000000"/>
+          <w:sz w:val="22"/>
+          <w:szCs w:val="22"/>
+          <w:lang w:eastAsia="es-AR"/>
         </w:rPr>
       </w:pPr>
     </w:p>
@@ -259,6 +597,77 @@
 
 <file path=word/footer1.xml><?xml version="1.0" encoding="utf-8"?>
 <w:ftr xmlns:wpc="http://schemas.microsoft.com/office/word/2010/wordprocessingCanvas" xmlns:cx="http://schemas.microsoft.com/office/drawing/2014/chartex" xmlns:cx1="http://schemas.microsoft.com/office/drawing/2015/9/8/chartex" xmlns:cx2="http://schemas.microsoft.com/office/drawing/2015/10/21/chartex" xmlns:cx3="http://schemas.microsoft.com/office/drawing/2016/5/9/chartex" xmlns:cx4="http://schemas.microsoft.com/office/drawing/2016/5/10/chartex" xmlns:cx5="http://schemas.microsoft.com/office/drawing/2016/5/11/chartex" xmlns:cx6="http://schemas.microsoft.com/office/drawing/2016/5/12/chartex" xmlns:cx7="http://schemas.microsoft.com/office/drawing/2016/5/13/chartex" xmlns:cx8="http://schemas.microsoft.com/office/drawing/2016/5/14/chartex" xmlns:mc="http://schemas.openxmlformats.org/markup-compatibility/2006" xmlns:aink="http://schemas.microsoft.com/office/drawing/2016/ink" xmlns:am3d="http://schemas.microsoft.com/office/drawing/2017/model3d" xmlns:o="urn:schemas-microsoft-com:office:office" xmlns:oel="http://schemas.microsoft.com/office/2019/extlst" xmlns:r="http://schemas.openxmlformats.org/officeDocument/2006/relationships" xmlns:m="http://schemas.openxmlformats.org/officeDocument/2006/math" xmlns:v="urn:schemas-microsoft-com:vml" xmlns:wp14="http://schemas.microsoft.com/office/word/2010/wordprocessingDrawing" xmlns:wp="http://schemas.openxmlformats.org/drawingml/2006/wordprocessingDrawing" xmlns:w10="urn:schemas-microsoft-com:office:word" xmlns:w="http://schemas.openxmlformats.org/wordprocessingml/2006/main" xmlns:w14="http://schemas.microsoft.com/office/word/2010/wordml" xmlns:w15="http://schemas.microsoft.com/office/word/2012/wordml" xmlns:w16cex="http://schemas.microsoft.com/office/word/2018/wordml/cex" xmlns:w16cid="http://schemas.microsoft.com/office/word/2016/wordml/cid" xmlns:w16="http://schemas.microsoft.com/office/word/2018/wordml" xmlns:w16du="http://schemas.microsoft.com/office/word/2023/wordml/word16du" xmlns:w16sdtdh="http://schemas.microsoft.com/office/word/2020/wordml/sdtdatahash" xmlns:w16sdtfl="http://schemas.microsoft.com/office/word/2024/wordml/sdtformatlock" xmlns:w16se="http://schemas.microsoft.com/office/word/2015/wordml/symex" xmlns:wpg="http://schemas.microsoft.com/office/word/2010/wordprocessingGroup" xmlns:wpi="http://schemas.microsoft.com/office/word/2010/wordprocessingInk" xmlns:wne="http://schemas.microsoft.com/office/word/2006/wordml" xmlns:wps="http://schemas.microsoft.com/office/word/2010/wordprocessingShape" mc:Ignorable="w14 w15 w16se w16cid w16 w16cex w16sdtdh w16sdtfl w16du wp14">
+  <w:p>
+    <w:pPr>
+      <w:pStyle w:val="Sinespaciado"/>
+      <w:spacing w:line="360" w:lineRule="auto"/>
+      <w:jc w:val="both"/>
+      <w:rPr>
+        <w:rFonts w:ascii="Caladea" w:hAnsi="Caladea" w:cs="Courier New"/>
+        <w:color w:val="000000"/>
+        <w:sz w:val="28"/>
+        <w:szCs w:val="28"/>
+        <w:lang w:val="es-AR" w:eastAsia="es-AR"/>
+      </w:rPr>
+    </w:pPr>
+    <w:r>
+      <w:rPr>
+        <w:rFonts w:ascii="Caladea" w:hAnsi="Caladea" w:cs="Courier New"/>
+        <w:b/>
+        <w:color w:val="000000"/>
+        <w:sz w:val="22"/>
+        <w:szCs w:val="22"/>
+        <w:lang w:eastAsia="es-AR"/>
+      </w:rPr>
+      <w:t>Vigencia</w:t>
+    </w:r>
+    <w:r>
+      <w:rPr>
+        <w:rFonts w:ascii="Caladea" w:hAnsi="Caladea" w:cs="Courier New"/>
+        <w:bCs w:val="0"/>
+        <w:color w:val="000000"/>
+        <w:sz w:val="22"/>
+        <w:szCs w:val="22"/>
+        <w:lang w:eastAsia="es-AR"/>
+      </w:rPr>
+      <w:t xml:space="preserve">: Se hace saber que, de conformidad con lo dispuesto en el art. 6 del Anexo I de la Acordada 30.004 de la </w:t>
+    </w:r>
+    <w:proofErr w:type="spellStart"/>
+    <w:r>
+      <w:rPr>
+        <w:rFonts w:ascii="Caladea" w:hAnsi="Caladea" w:cs="Courier New"/>
+        <w:bCs w:val="0"/>
+        <w:color w:val="000000"/>
+        <w:sz w:val="22"/>
+        <w:szCs w:val="22"/>
+        <w:lang w:eastAsia="es-AR"/>
+      </w:rPr>
+      <w:t>SCJMza</w:t>
+    </w:r>
+    <w:proofErr w:type="spellEnd"/>
+    <w:r>
+      <w:rPr>
+        <w:rFonts w:ascii="Caladea" w:hAnsi="Caladea" w:cs="Courier New"/>
+        <w:bCs w:val="0"/>
+        <w:color w:val="000000"/>
+        <w:sz w:val="22"/>
+        <w:szCs w:val="22"/>
+        <w:lang w:eastAsia="es-AR"/>
+      </w:rPr>
+      <w:t>, el presente certificado tiene una validez de un año a los fines de iniciar las correspondientes acciones judiciales. Antes del vencimiento de dicho plazo el interesado podrá solicitar una nueva instancia de mediación, siempre que se cumplan las siguientes condiciones: a) que no se hayan iniciado las mencionadas acciones; b) que se aporten datos que permitan la localización del requerido; y c) que exista voluntad de ambas partes para mediar, la cual será verificada por este organismo en forma previa a la fijación de audiencia</w:t>
+    </w:r>
+    <w:r>
+      <w:rPr>
+        <w:rFonts w:ascii="Caladea" w:hAnsi="Caladea" w:cs="Courier New"/>
+        <w:bCs w:val="0"/>
+        <w:color w:val="000000"/>
+        <w:sz w:val="22"/>
+        <w:szCs w:val="22"/>
+        <w:lang w:eastAsia="es-AR"/>
+      </w:rPr>
+      <w:t>.</w:t>
+    </w:r>
+  </w:p>
   <w:p>
     <w:pPr>
       <w:pStyle w:val="Standard"/>
@@ -877,7 +1286,6 @@
   <w:style w:type="character" w:default="1" w:styleId="Fuentedeprrafopredeter">
     <w:name w:val="Default Paragraph Font"/>
     <w:uiPriority w:val="1"/>
-    <w:semiHidden/>
     <w:unhideWhenUsed/>
   </w:style>
   <w:style w:type="table" w:default="1" w:styleId="Tablanormal">
@@ -1002,6 +1410,7 @@
   <w:style w:type="paragraph" w:styleId="NormalWeb">
     <w:name w:val="Normal (Web)"/>
     <w:basedOn w:val="Standard"/>
+    <w:uiPriority w:val="99"/>
     <w:pPr>
       <w:spacing w:before="280" w:after="280" w:line="240" w:lineRule="auto"/>
       <w:jc w:val="left"/>

</xml_diff>